<commit_message>
fix: Se actualizo la documentacion
</commit_message>
<xml_diff>
--- a/Docs/Manual Tecnico.docx
+++ b/Docs/Manual Tecnico.docx
@@ -69,7 +69,7 @@
     <w:p>
       <w:pPr>
         <w:pBdr>
-          <w:bottom w:val="single" w:sz="8" w:space="8" w:color="1F4E79"/>
+          <w:bottom w:val="single" w:sz="8" w:space="8" w:color="000000"/>
         </w:pBdr>
         <w:spacing w:before="120"/>
         <w:jc w:val="center"/>
@@ -4595,7 +4595,7 @@
               <w:bottom w:val="single" w:sz="4" w:space="0" w:color="BFBFBF"/>
               <w:right w:val="single" w:sz="4" w:space="0" w:color="BFBFBF"/>
             </w:tcBorders>
-            <w:shd w:val="clear" w:color="auto" w:fill="1F4E79"/>
+            <w:shd w:val="clear" w:color="auto" w:fill="D9D9D9"/>
             <w:tcMar>
               <w:top w:w="60" w:type="dxa"/>
               <w:left w:w="100" w:type="dxa"/>
@@ -4616,7 +4616,7 @@
                 <w:rFonts w:ascii="Times New Roman" w:hAnsi="Times New Roman" w:cs="Times New Roman"/>
                 <w:b/>
                 <w:bCs/>
-                <w:color w:val="FFFFFF"/>
+                <w:color w:val="000000"/>
                 <w:sz w:val="24"/>
                 <w:szCs w:val="24"/>
               </w:rPr>
@@ -4633,7 +4633,7 @@
               <w:bottom w:val="single" w:sz="4" w:space="0" w:color="BFBFBF"/>
               <w:right w:val="single" w:sz="4" w:space="0" w:color="BFBFBF"/>
             </w:tcBorders>
-            <w:shd w:val="clear" w:color="auto" w:fill="1F4E79"/>
+            <w:shd w:val="clear" w:color="auto" w:fill="D9D9D9"/>
             <w:tcMar>
               <w:top w:w="60" w:type="dxa"/>
               <w:left w:w="100" w:type="dxa"/>
@@ -4654,7 +4654,7 @@
                 <w:rFonts w:ascii="Times New Roman" w:hAnsi="Times New Roman" w:cs="Times New Roman"/>
                 <w:b/>
                 <w:bCs/>
-                <w:color w:val="FFFFFF"/>
+                <w:color w:val="000000"/>
                 <w:sz w:val="24"/>
                 <w:szCs w:val="24"/>
               </w:rPr>
@@ -4671,7 +4671,7 @@
               <w:bottom w:val="single" w:sz="4" w:space="0" w:color="BFBFBF"/>
               <w:right w:val="single" w:sz="4" w:space="0" w:color="BFBFBF"/>
             </w:tcBorders>
-            <w:shd w:val="clear" w:color="auto" w:fill="1F4E79"/>
+            <w:shd w:val="clear" w:color="auto" w:fill="D9D9D9"/>
             <w:tcMar>
               <w:top w:w="60" w:type="dxa"/>
               <w:left w:w="100" w:type="dxa"/>
@@ -4692,7 +4692,7 @@
                 <w:rFonts w:ascii="Times New Roman" w:hAnsi="Times New Roman" w:cs="Times New Roman"/>
                 <w:b/>
                 <w:bCs/>
-                <w:color w:val="FFFFFF"/>
+                <w:color w:val="000000"/>
                 <w:sz w:val="24"/>
                 <w:szCs w:val="24"/>
               </w:rPr>
@@ -6675,7 +6675,7 @@
               <w:bottom w:val="single" w:sz="4" w:space="0" w:color="BFBFBF"/>
               <w:right w:val="single" w:sz="4" w:space="0" w:color="BFBFBF"/>
             </w:tcBorders>
-            <w:shd w:val="clear" w:color="auto" w:fill="1F4E79"/>
+            <w:shd w:val="clear" w:color="auto" w:fill="D9D9D9"/>
             <w:tcMar>
               <w:top w:w="60" w:type="dxa"/>
               <w:left w:w="100" w:type="dxa"/>
@@ -6696,7 +6696,7 @@
                 <w:rFonts w:ascii="Times New Roman" w:hAnsi="Times New Roman" w:cs="Times New Roman"/>
                 <w:b/>
                 <w:bCs/>
-                <w:color w:val="FFFFFF"/>
+                <w:color w:val="000000"/>
                 <w:sz w:val="24"/>
                 <w:szCs w:val="24"/>
               </w:rPr>
@@ -6713,7 +6713,7 @@
               <w:bottom w:val="single" w:sz="4" w:space="0" w:color="BFBFBF"/>
               <w:right w:val="single" w:sz="4" w:space="0" w:color="BFBFBF"/>
             </w:tcBorders>
-            <w:shd w:val="clear" w:color="auto" w:fill="1F4E79"/>
+            <w:shd w:val="clear" w:color="auto" w:fill="D9D9D9"/>
             <w:tcMar>
               <w:top w:w="60" w:type="dxa"/>
               <w:left w:w="100" w:type="dxa"/>
@@ -6734,7 +6734,7 @@
                 <w:rFonts w:ascii="Times New Roman" w:hAnsi="Times New Roman" w:cs="Times New Roman"/>
                 <w:b/>
                 <w:bCs/>
-                <w:color w:val="FFFFFF"/>
+                <w:color w:val="000000"/>
                 <w:sz w:val="24"/>
                 <w:szCs w:val="24"/>
               </w:rPr>
@@ -6751,7 +6751,7 @@
               <w:bottom w:val="single" w:sz="4" w:space="0" w:color="BFBFBF"/>
               <w:right w:val="single" w:sz="4" w:space="0" w:color="BFBFBF"/>
             </w:tcBorders>
-            <w:shd w:val="clear" w:color="auto" w:fill="1F4E79"/>
+            <w:shd w:val="clear" w:color="auto" w:fill="D9D9D9"/>
             <w:tcMar>
               <w:top w:w="60" w:type="dxa"/>
               <w:left w:w="100" w:type="dxa"/>
@@ -6772,7 +6772,7 @@
                 <w:rFonts w:ascii="Times New Roman" w:hAnsi="Times New Roman" w:cs="Times New Roman"/>
                 <w:b/>
                 <w:bCs/>
-                <w:color w:val="FFFFFF"/>
+                <w:color w:val="000000"/>
                 <w:sz w:val="24"/>
                 <w:szCs w:val="24"/>
               </w:rPr>
@@ -6789,7 +6789,7 @@
               <w:bottom w:val="single" w:sz="4" w:space="0" w:color="BFBFBF"/>
               <w:right w:val="single" w:sz="4" w:space="0" w:color="BFBFBF"/>
             </w:tcBorders>
-            <w:shd w:val="clear" w:color="auto" w:fill="1F4E79"/>
+            <w:shd w:val="clear" w:color="auto" w:fill="D9D9D9"/>
             <w:tcMar>
               <w:top w:w="60" w:type="dxa"/>
               <w:left w:w="100" w:type="dxa"/>
@@ -6810,7 +6810,7 @@
                 <w:rFonts w:ascii="Times New Roman" w:hAnsi="Times New Roman" w:cs="Times New Roman"/>
                 <w:b/>
                 <w:bCs/>
-                <w:color w:val="FFFFFF"/>
+                <w:color w:val="000000"/>
                 <w:sz w:val="24"/>
                 <w:szCs w:val="24"/>
               </w:rPr>
@@ -12702,7 +12702,7 @@
               <w:bottom w:val="single" w:sz="4" w:space="0" w:color="BFBFBF"/>
               <w:right w:val="single" w:sz="4" w:space="0" w:color="BFBFBF"/>
             </w:tcBorders>
-            <w:shd w:val="clear" w:color="auto" w:fill="1F4E79"/>
+            <w:shd w:val="clear" w:color="auto" w:fill="D9D9D9"/>
             <w:tcMar>
               <w:top w:w="60" w:type="dxa"/>
               <w:left w:w="100" w:type="dxa"/>
@@ -12721,7 +12721,7 @@
                 <w:rFonts w:ascii="Times New Roman" w:hAnsi="Times New Roman" w:cs="Times New Roman"/>
                 <w:b/>
                 <w:bCs/>
-                <w:color w:val="FFFFFF"/>
+                <w:color w:val="000000"/>
                 <w:sz w:val="19"/>
                 <w:szCs w:val="19"/>
               </w:rPr>
@@ -12738,7 +12738,7 @@
               <w:bottom w:val="single" w:sz="4" w:space="0" w:color="BFBFBF"/>
               <w:right w:val="single" w:sz="4" w:space="0" w:color="BFBFBF"/>
             </w:tcBorders>
-            <w:shd w:val="clear" w:color="auto" w:fill="1F4E79"/>
+            <w:shd w:val="clear" w:color="auto" w:fill="D9D9D9"/>
             <w:tcMar>
               <w:top w:w="60" w:type="dxa"/>
               <w:left w:w="100" w:type="dxa"/>
@@ -12757,7 +12757,7 @@
                 <w:rFonts w:ascii="Times New Roman" w:hAnsi="Times New Roman" w:cs="Times New Roman"/>
                 <w:b/>
                 <w:bCs/>
-                <w:color w:val="FFFFFF"/>
+                <w:color w:val="000000"/>
                 <w:sz w:val="19"/>
                 <w:szCs w:val="19"/>
               </w:rPr>
@@ -12774,7 +12774,7 @@
               <w:bottom w:val="single" w:sz="4" w:space="0" w:color="BFBFBF"/>
               <w:right w:val="single" w:sz="4" w:space="0" w:color="BFBFBF"/>
             </w:tcBorders>
-            <w:shd w:val="clear" w:color="auto" w:fill="1F4E79"/>
+            <w:shd w:val="clear" w:color="auto" w:fill="D9D9D9"/>
             <w:tcMar>
               <w:top w:w="60" w:type="dxa"/>
               <w:left w:w="100" w:type="dxa"/>
@@ -12793,7 +12793,7 @@
                 <w:rFonts w:ascii="Times New Roman" w:hAnsi="Times New Roman" w:cs="Times New Roman"/>
                 <w:b/>
                 <w:bCs/>
-                <w:color w:val="FFFFFF"/>
+                <w:color w:val="000000"/>
                 <w:sz w:val="19"/>
                 <w:szCs w:val="19"/>
               </w:rPr>
@@ -12810,7 +12810,7 @@
               <w:bottom w:val="single" w:sz="4" w:space="0" w:color="BFBFBF"/>
               <w:right w:val="single" w:sz="4" w:space="0" w:color="BFBFBF"/>
             </w:tcBorders>
-            <w:shd w:val="clear" w:color="auto" w:fill="1F4E79"/>
+            <w:shd w:val="clear" w:color="auto" w:fill="D9D9D9"/>
             <w:tcMar>
               <w:top w:w="60" w:type="dxa"/>
               <w:left w:w="100" w:type="dxa"/>
@@ -12829,7 +12829,7 @@
                 <w:rFonts w:ascii="Times New Roman" w:hAnsi="Times New Roman" w:cs="Times New Roman"/>
                 <w:b/>
                 <w:bCs/>
-                <w:color w:val="FFFFFF"/>
+                <w:color w:val="000000"/>
                 <w:sz w:val="19"/>
                 <w:szCs w:val="19"/>
               </w:rPr>
@@ -16458,7 +16458,7 @@
               <w:bottom w:val="single" w:sz="4" w:space="0" w:color="BFBFBF"/>
               <w:right w:val="single" w:sz="4" w:space="0" w:color="BFBFBF"/>
             </w:tcBorders>
-            <w:shd w:val="clear" w:color="auto" w:fill="1F4E79"/>
+            <w:shd w:val="clear" w:color="auto" w:fill="D9D9D9"/>
             <w:tcMar>
               <w:top w:w="60" w:type="dxa"/>
               <w:left w:w="100" w:type="dxa"/>
@@ -16479,7 +16479,7 @@
                 <w:rFonts w:ascii="Times New Roman" w:hAnsi="Times New Roman" w:cs="Times New Roman"/>
                 <w:b/>
                 <w:bCs/>
-                <w:color w:val="FFFFFF"/>
+                <w:color w:val="000000"/>
                 <w:sz w:val="24"/>
                 <w:szCs w:val="24"/>
               </w:rPr>
@@ -16496,7 +16496,7 @@
               <w:bottom w:val="single" w:sz="4" w:space="0" w:color="BFBFBF"/>
               <w:right w:val="single" w:sz="4" w:space="0" w:color="BFBFBF"/>
             </w:tcBorders>
-            <w:shd w:val="clear" w:color="auto" w:fill="1F4E79"/>
+            <w:shd w:val="clear" w:color="auto" w:fill="D9D9D9"/>
             <w:tcMar>
               <w:top w:w="60" w:type="dxa"/>
               <w:left w:w="100" w:type="dxa"/>
@@ -16517,7 +16517,7 @@
                 <w:rFonts w:ascii="Times New Roman" w:hAnsi="Times New Roman" w:cs="Times New Roman"/>
                 <w:b/>
                 <w:bCs/>
-                <w:color w:val="FFFFFF"/>
+                <w:color w:val="000000"/>
                 <w:sz w:val="24"/>
                 <w:szCs w:val="24"/>
               </w:rPr>
@@ -16534,7 +16534,7 @@
               <w:bottom w:val="single" w:sz="4" w:space="0" w:color="BFBFBF"/>
               <w:right w:val="single" w:sz="4" w:space="0" w:color="BFBFBF"/>
             </w:tcBorders>
-            <w:shd w:val="clear" w:color="auto" w:fill="1F4E79"/>
+            <w:shd w:val="clear" w:color="auto" w:fill="D9D9D9"/>
             <w:tcMar>
               <w:top w:w="60" w:type="dxa"/>
               <w:left w:w="100" w:type="dxa"/>
@@ -16555,7 +16555,7 @@
                 <w:rFonts w:ascii="Times New Roman" w:hAnsi="Times New Roman" w:cs="Times New Roman"/>
                 <w:b/>
                 <w:bCs/>
-                <w:color w:val="FFFFFF"/>
+                <w:color w:val="000000"/>
                 <w:sz w:val="24"/>
                 <w:szCs w:val="24"/>
               </w:rPr>
@@ -18690,7 +18690,7 @@
               <w:bottom w:val="single" w:sz="4" w:space="0" w:color="BFBFBF"/>
               <w:right w:val="single" w:sz="4" w:space="0" w:color="BFBFBF"/>
             </w:tcBorders>
-            <w:shd w:val="clear" w:color="auto" w:fill="1F4E79"/>
+            <w:shd w:val="clear" w:color="auto" w:fill="D9D9D9"/>
             <w:tcMar>
               <w:top w:w="60" w:type="dxa"/>
               <w:left w:w="100" w:type="dxa"/>
@@ -18711,7 +18711,7 @@
                 <w:rFonts w:ascii="Times New Roman" w:hAnsi="Times New Roman" w:cs="Times New Roman"/>
                 <w:b/>
                 <w:bCs/>
-                <w:color w:val="FFFFFF"/>
+                <w:color w:val="000000"/>
                 <w:sz w:val="20"/>
                 <w:szCs w:val="20"/>
               </w:rPr>
@@ -18728,7 +18728,7 @@
               <w:bottom w:val="single" w:sz="4" w:space="0" w:color="BFBFBF"/>
               <w:right w:val="single" w:sz="4" w:space="0" w:color="BFBFBF"/>
             </w:tcBorders>
-            <w:shd w:val="clear" w:color="auto" w:fill="1F4E79"/>
+            <w:shd w:val="clear" w:color="auto" w:fill="D9D9D9"/>
             <w:tcMar>
               <w:top w:w="60" w:type="dxa"/>
               <w:left w:w="100" w:type="dxa"/>
@@ -18750,7 +18750,7 @@
                 <w:rFonts w:ascii="Times New Roman" w:hAnsi="Times New Roman" w:cs="Times New Roman"/>
                 <w:b/>
                 <w:bCs/>
-                <w:color w:val="FFFFFF"/>
+                <w:color w:val="000000"/>
                 <w:sz w:val="20"/>
                 <w:szCs w:val="20"/>
               </w:rPr>
@@ -18762,7 +18762,7 @@
                 <w:rFonts w:ascii="Times New Roman" w:hAnsi="Times New Roman" w:cs="Times New Roman"/>
                 <w:b/>
                 <w:bCs/>
-                <w:color w:val="FFFFFF"/>
+                <w:color w:val="000000"/>
                 <w:sz w:val="20"/>
                 <w:szCs w:val="20"/>
               </w:rPr>
@@ -19420,7 +19420,7 @@
               <w:bottom w:val="single" w:sz="4" w:space="0" w:color="BFBFBF"/>
               <w:right w:val="single" w:sz="4" w:space="0" w:color="BFBFBF"/>
             </w:tcBorders>
-            <w:shd w:val="clear" w:color="auto" w:fill="1F4E79"/>
+            <w:shd w:val="clear" w:color="auto" w:fill="D9D9D9"/>
             <w:tcMar>
               <w:top w:w="60" w:type="dxa"/>
               <w:left w:w="100" w:type="dxa"/>
@@ -19441,7 +19441,7 @@
                 <w:rFonts w:ascii="Times New Roman" w:hAnsi="Times New Roman" w:cs="Times New Roman"/>
                 <w:b/>
                 <w:bCs/>
-                <w:color w:val="FFFFFF"/>
+                <w:color w:val="000000"/>
                 <w:sz w:val="20"/>
                 <w:szCs w:val="20"/>
               </w:rPr>
@@ -19458,7 +19458,7 @@
               <w:bottom w:val="single" w:sz="4" w:space="0" w:color="BFBFBF"/>
               <w:right w:val="single" w:sz="4" w:space="0" w:color="BFBFBF"/>
             </w:tcBorders>
-            <w:shd w:val="clear" w:color="auto" w:fill="1F4E79"/>
+            <w:shd w:val="clear" w:color="auto" w:fill="D9D9D9"/>
             <w:tcMar>
               <w:top w:w="60" w:type="dxa"/>
               <w:left w:w="100" w:type="dxa"/>
@@ -19479,7 +19479,7 @@
                 <w:rFonts w:ascii="Times New Roman" w:hAnsi="Times New Roman" w:cs="Times New Roman"/>
                 <w:b/>
                 <w:bCs/>
-                <w:color w:val="FFFFFF"/>
+                <w:color w:val="000000"/>
                 <w:sz w:val="20"/>
                 <w:szCs w:val="20"/>
               </w:rPr>
@@ -19496,7 +19496,7 @@
               <w:bottom w:val="single" w:sz="4" w:space="0" w:color="BFBFBF"/>
               <w:right w:val="single" w:sz="4" w:space="0" w:color="BFBFBF"/>
             </w:tcBorders>
-            <w:shd w:val="clear" w:color="auto" w:fill="1F4E79"/>
+            <w:shd w:val="clear" w:color="auto" w:fill="D9D9D9"/>
             <w:tcMar>
               <w:top w:w="60" w:type="dxa"/>
               <w:left w:w="100" w:type="dxa"/>
@@ -19517,7 +19517,7 @@
                 <w:rFonts w:ascii="Times New Roman" w:hAnsi="Times New Roman" w:cs="Times New Roman"/>
                 <w:b/>
                 <w:bCs/>
-                <w:color w:val="FFFFFF"/>
+                <w:color w:val="000000"/>
                 <w:sz w:val="20"/>
                 <w:szCs w:val="20"/>
               </w:rPr>
@@ -20903,7 +20903,7 @@
               <w:bottom w:val="single" w:sz="4" w:space="0" w:color="BFBFBF"/>
               <w:right w:val="single" w:sz="4" w:space="0" w:color="BFBFBF"/>
             </w:tcBorders>
-            <w:shd w:val="clear" w:color="auto" w:fill="1F4E79"/>
+            <w:shd w:val="clear" w:color="auto" w:fill="D9D9D9"/>
             <w:tcMar>
               <w:top w:w="60" w:type="dxa"/>
               <w:left w:w="100" w:type="dxa"/>
@@ -20924,7 +20924,7 @@
                 <w:rFonts w:ascii="Times New Roman" w:hAnsi="Times New Roman" w:cs="Times New Roman"/>
                 <w:b/>
                 <w:bCs/>
-                <w:color w:val="FFFFFF"/>
+                <w:color w:val="000000"/>
                 <w:sz w:val="20"/>
                 <w:szCs w:val="20"/>
               </w:rPr>
@@ -20941,7 +20941,7 @@
               <w:bottom w:val="single" w:sz="4" w:space="0" w:color="BFBFBF"/>
               <w:right w:val="single" w:sz="4" w:space="0" w:color="BFBFBF"/>
             </w:tcBorders>
-            <w:shd w:val="clear" w:color="auto" w:fill="1F4E79"/>
+            <w:shd w:val="clear" w:color="auto" w:fill="D9D9D9"/>
             <w:tcMar>
               <w:top w:w="60" w:type="dxa"/>
               <w:left w:w="100" w:type="dxa"/>
@@ -20962,7 +20962,7 @@
                 <w:rFonts w:ascii="Times New Roman" w:hAnsi="Times New Roman" w:cs="Times New Roman"/>
                 <w:b/>
                 <w:bCs/>
-                <w:color w:val="FFFFFF"/>
+                <w:color w:val="000000"/>
                 <w:sz w:val="20"/>
                 <w:szCs w:val="20"/>
               </w:rPr>
@@ -20979,7 +20979,7 @@
               <w:bottom w:val="single" w:sz="4" w:space="0" w:color="BFBFBF"/>
               <w:right w:val="single" w:sz="4" w:space="0" w:color="BFBFBF"/>
             </w:tcBorders>
-            <w:shd w:val="clear" w:color="auto" w:fill="1F4E79"/>
+            <w:shd w:val="clear" w:color="auto" w:fill="D9D9D9"/>
             <w:tcMar>
               <w:top w:w="60" w:type="dxa"/>
               <w:left w:w="100" w:type="dxa"/>
@@ -21000,7 +21000,7 @@
                 <w:rFonts w:ascii="Times New Roman" w:hAnsi="Times New Roman" w:cs="Times New Roman"/>
                 <w:b/>
                 <w:bCs/>
-                <w:color w:val="FFFFFF"/>
+                <w:color w:val="000000"/>
                 <w:sz w:val="20"/>
                 <w:szCs w:val="20"/>
               </w:rPr>
@@ -21950,7 +21950,7 @@
               <w:bottom w:val="single" w:sz="4" w:space="0" w:color="BFBFBF"/>
               <w:right w:val="single" w:sz="4" w:space="0" w:color="BFBFBF"/>
             </w:tcBorders>
-            <w:shd w:val="clear" w:color="auto" w:fill="1F4E79"/>
+            <w:shd w:val="clear" w:color="auto" w:fill="D9D9D9"/>
             <w:tcMar>
               <w:top w:w="60" w:type="dxa"/>
               <w:left w:w="100" w:type="dxa"/>
@@ -21972,7 +21972,7 @@
                 <w:rFonts w:ascii="Times New Roman" w:hAnsi="Times New Roman" w:cs="Times New Roman"/>
                 <w:b/>
                 <w:bCs/>
-                <w:color w:val="FFFFFF"/>
+                <w:color w:val="000000"/>
                 <w:sz w:val="20"/>
                 <w:szCs w:val="20"/>
               </w:rPr>
@@ -21989,7 +21989,7 @@
               <w:bottom w:val="single" w:sz="4" w:space="0" w:color="BFBFBF"/>
               <w:right w:val="single" w:sz="4" w:space="0" w:color="BFBFBF"/>
             </w:tcBorders>
-            <w:shd w:val="clear" w:color="auto" w:fill="1F4E79"/>
+            <w:shd w:val="clear" w:color="auto" w:fill="D9D9D9"/>
             <w:tcMar>
               <w:top w:w="60" w:type="dxa"/>
               <w:left w:w="100" w:type="dxa"/>
@@ -22011,7 +22011,7 @@
                 <w:rFonts w:ascii="Times New Roman" w:hAnsi="Times New Roman" w:cs="Times New Roman"/>
                 <w:b/>
                 <w:bCs/>
-                <w:color w:val="FFFFFF"/>
+                <w:color w:val="000000"/>
                 <w:sz w:val="20"/>
                 <w:szCs w:val="20"/>
               </w:rPr>
@@ -22028,7 +22028,7 @@
               <w:bottom w:val="single" w:sz="4" w:space="0" w:color="BFBFBF"/>
               <w:right w:val="single" w:sz="4" w:space="0" w:color="BFBFBF"/>
             </w:tcBorders>
-            <w:shd w:val="clear" w:color="auto" w:fill="1F4E79"/>
+            <w:shd w:val="clear" w:color="auto" w:fill="D9D9D9"/>
             <w:tcMar>
               <w:top w:w="60" w:type="dxa"/>
               <w:left w:w="100" w:type="dxa"/>
@@ -22050,7 +22050,7 @@
                 <w:rFonts w:ascii="Times New Roman" w:hAnsi="Times New Roman" w:cs="Times New Roman"/>
                 <w:b/>
                 <w:bCs/>
-                <w:color w:val="FFFFFF"/>
+                <w:color w:val="000000"/>
                 <w:sz w:val="20"/>
                 <w:szCs w:val="20"/>
               </w:rPr>
@@ -23106,7 +23106,7 @@
               <w:bottom w:val="single" w:sz="4" w:space="0" w:color="BFBFBF"/>
               <w:right w:val="single" w:sz="4" w:space="0" w:color="BFBFBF"/>
             </w:tcBorders>
-            <w:shd w:val="clear" w:color="auto" w:fill="1F4E79"/>
+            <w:shd w:val="clear" w:color="auto" w:fill="D9D9D9"/>
             <w:tcMar>
               <w:top w:w="60" w:type="dxa"/>
               <w:left w:w="100" w:type="dxa"/>
@@ -23127,7 +23127,7 @@
                 <w:rFonts w:ascii="Times New Roman" w:hAnsi="Times New Roman" w:cs="Times New Roman"/>
                 <w:b/>
                 <w:bCs/>
-                <w:color w:val="FFFFFF"/>
+                <w:color w:val="000000"/>
                 <w:sz w:val="20"/>
                 <w:szCs w:val="20"/>
               </w:rPr>
@@ -23144,7 +23144,7 @@
               <w:bottom w:val="single" w:sz="4" w:space="0" w:color="BFBFBF"/>
               <w:right w:val="single" w:sz="4" w:space="0" w:color="BFBFBF"/>
             </w:tcBorders>
-            <w:shd w:val="clear" w:color="auto" w:fill="1F4E79"/>
+            <w:shd w:val="clear" w:color="auto" w:fill="D9D9D9"/>
             <w:tcMar>
               <w:top w:w="60" w:type="dxa"/>
               <w:left w:w="100" w:type="dxa"/>
@@ -23165,7 +23165,7 @@
                 <w:rFonts w:ascii="Times New Roman" w:hAnsi="Times New Roman" w:cs="Times New Roman"/>
                 <w:b/>
                 <w:bCs/>
-                <w:color w:val="FFFFFF"/>
+                <w:color w:val="000000"/>
                 <w:sz w:val="20"/>
                 <w:szCs w:val="20"/>
               </w:rPr>
@@ -23182,7 +23182,7 @@
               <w:bottom w:val="single" w:sz="4" w:space="0" w:color="BFBFBF"/>
               <w:right w:val="single" w:sz="4" w:space="0" w:color="BFBFBF"/>
             </w:tcBorders>
-            <w:shd w:val="clear" w:color="auto" w:fill="1F4E79"/>
+            <w:shd w:val="clear" w:color="auto" w:fill="D9D9D9"/>
             <w:tcMar>
               <w:top w:w="60" w:type="dxa"/>
               <w:left w:w="100" w:type="dxa"/>
@@ -23203,7 +23203,7 @@
                 <w:rFonts w:ascii="Times New Roman" w:hAnsi="Times New Roman" w:cs="Times New Roman"/>
                 <w:b/>
                 <w:bCs/>
-                <w:color w:val="FFFFFF"/>
+                <w:color w:val="000000"/>
                 <w:sz w:val="20"/>
                 <w:szCs w:val="20"/>
               </w:rPr>
@@ -24648,7 +24648,7 @@
               <w:bottom w:val="single" w:sz="4" w:space="0" w:color="BFBFBF"/>
               <w:right w:val="single" w:sz="4" w:space="0" w:color="BFBFBF"/>
             </w:tcBorders>
-            <w:shd w:val="clear" w:color="auto" w:fill="1F4E79"/>
+            <w:shd w:val="clear" w:color="auto" w:fill="D9D9D9"/>
             <w:tcMar>
               <w:top w:w="60" w:type="dxa"/>
               <w:left w:w="100" w:type="dxa"/>
@@ -24670,7 +24670,7 @@
                 <w:rFonts w:ascii="Times New Roman" w:hAnsi="Times New Roman" w:cs="Times New Roman"/>
                 <w:b/>
                 <w:bCs/>
-                <w:color w:val="FFFFFF"/>
+                <w:color w:val="000000"/>
                 <w:sz w:val="20"/>
                 <w:szCs w:val="20"/>
               </w:rPr>
@@ -24688,7 +24688,7 @@
               <w:bottom w:val="single" w:sz="4" w:space="0" w:color="BFBFBF"/>
               <w:right w:val="single" w:sz="4" w:space="0" w:color="BFBFBF"/>
             </w:tcBorders>
-            <w:shd w:val="clear" w:color="auto" w:fill="1F4E79"/>
+            <w:shd w:val="clear" w:color="auto" w:fill="D9D9D9"/>
             <w:tcMar>
               <w:top w:w="60" w:type="dxa"/>
               <w:left w:w="100" w:type="dxa"/>
@@ -24709,7 +24709,7 @@
                 <w:rFonts w:ascii="Times New Roman" w:hAnsi="Times New Roman" w:cs="Times New Roman"/>
                 <w:b/>
                 <w:bCs/>
-                <w:color w:val="FFFFFF"/>
+                <w:color w:val="000000"/>
                 <w:sz w:val="20"/>
                 <w:szCs w:val="20"/>
               </w:rPr>
@@ -25945,7 +25945,7 @@
               <w:bottom w:val="single" w:sz="4" w:space="0" w:color="BFBFBF"/>
               <w:right w:val="single" w:sz="4" w:space="0" w:color="BFBFBF"/>
             </w:tcBorders>
-            <w:shd w:val="clear" w:color="auto" w:fill="1F4E79"/>
+            <w:shd w:val="clear" w:color="auto" w:fill="D9D9D9"/>
             <w:tcMar>
               <w:top w:w="60" w:type="dxa"/>
               <w:left w:w="100" w:type="dxa"/>
@@ -25966,7 +25966,7 @@
                 <w:rFonts w:ascii="Times New Roman" w:hAnsi="Times New Roman" w:cs="Times New Roman"/>
                 <w:b/>
                 <w:bCs/>
-                <w:color w:val="FFFFFF"/>
+                <w:color w:val="000000"/>
                 <w:sz w:val="20"/>
                 <w:szCs w:val="20"/>
               </w:rPr>
@@ -25983,7 +25983,7 @@
               <w:bottom w:val="single" w:sz="4" w:space="0" w:color="BFBFBF"/>
               <w:right w:val="single" w:sz="4" w:space="0" w:color="BFBFBF"/>
             </w:tcBorders>
-            <w:shd w:val="clear" w:color="auto" w:fill="1F4E79"/>
+            <w:shd w:val="clear" w:color="auto" w:fill="D9D9D9"/>
             <w:tcMar>
               <w:top w:w="60" w:type="dxa"/>
               <w:left w:w="100" w:type="dxa"/>
@@ -26004,7 +26004,7 @@
                 <w:rFonts w:ascii="Times New Roman" w:hAnsi="Times New Roman" w:cs="Times New Roman"/>
                 <w:b/>
                 <w:bCs/>
-                <w:color w:val="FFFFFF"/>
+                <w:color w:val="000000"/>
                 <w:sz w:val="20"/>
                 <w:szCs w:val="20"/>
               </w:rPr>
@@ -26021,7 +26021,7 @@
               <w:bottom w:val="single" w:sz="4" w:space="0" w:color="BFBFBF"/>
               <w:right w:val="single" w:sz="4" w:space="0" w:color="BFBFBF"/>
             </w:tcBorders>
-            <w:shd w:val="clear" w:color="auto" w:fill="1F4E79"/>
+            <w:shd w:val="clear" w:color="auto" w:fill="D9D9D9"/>
             <w:tcMar>
               <w:top w:w="60" w:type="dxa"/>
               <w:left w:w="100" w:type="dxa"/>
@@ -26042,7 +26042,7 @@
                 <w:rFonts w:ascii="Times New Roman" w:hAnsi="Times New Roman" w:cs="Times New Roman"/>
                 <w:b/>
                 <w:bCs/>
-                <w:color w:val="FFFFFF"/>
+                <w:color w:val="000000"/>
                 <w:sz w:val="20"/>
                 <w:szCs w:val="20"/>
               </w:rPr>
@@ -26059,7 +26059,7 @@
               <w:bottom w:val="single" w:sz="4" w:space="0" w:color="BFBFBF"/>
               <w:right w:val="single" w:sz="4" w:space="0" w:color="BFBFBF"/>
             </w:tcBorders>
-            <w:shd w:val="clear" w:color="auto" w:fill="1F4E79"/>
+            <w:shd w:val="clear" w:color="auto" w:fill="D9D9D9"/>
             <w:tcMar>
               <w:top w:w="60" w:type="dxa"/>
               <w:left w:w="100" w:type="dxa"/>
@@ -26080,7 +26080,7 @@
                 <w:rFonts w:ascii="Times New Roman" w:hAnsi="Times New Roman" w:cs="Times New Roman"/>
                 <w:b/>
                 <w:bCs/>
-                <w:color w:val="FFFFFF"/>
+                <w:color w:val="000000"/>
                 <w:sz w:val="20"/>
                 <w:szCs w:val="20"/>
               </w:rPr>
@@ -27340,7 +27340,7 @@
               <w:bottom w:val="single" w:sz="4" w:space="0" w:color="BFBFBF"/>
               <w:right w:val="single" w:sz="4" w:space="0" w:color="BFBFBF"/>
             </w:tcBorders>
-            <w:shd w:val="clear" w:color="auto" w:fill="1F4E79"/>
+            <w:shd w:val="clear" w:color="auto" w:fill="D9D9D9"/>
             <w:tcMar>
               <w:top w:w="60" w:type="dxa"/>
               <w:left w:w="100" w:type="dxa"/>
@@ -27361,7 +27361,7 @@
                 <w:rFonts w:ascii="Times New Roman" w:hAnsi="Times New Roman" w:cs="Times New Roman"/>
                 <w:b/>
                 <w:bCs/>
-                <w:color w:val="FFFFFF"/>
+                <w:color w:val="000000"/>
                 <w:sz w:val="20"/>
                 <w:szCs w:val="20"/>
               </w:rPr>
@@ -27378,7 +27378,7 @@
               <w:bottom w:val="single" w:sz="4" w:space="0" w:color="BFBFBF"/>
               <w:right w:val="single" w:sz="4" w:space="0" w:color="BFBFBF"/>
             </w:tcBorders>
-            <w:shd w:val="clear" w:color="auto" w:fill="1F4E79"/>
+            <w:shd w:val="clear" w:color="auto" w:fill="D9D9D9"/>
             <w:tcMar>
               <w:top w:w="60" w:type="dxa"/>
               <w:left w:w="100" w:type="dxa"/>
@@ -27399,7 +27399,7 @@
                 <w:rFonts w:ascii="Times New Roman" w:hAnsi="Times New Roman" w:cs="Times New Roman"/>
                 <w:b/>
                 <w:bCs/>
-                <w:color w:val="FFFFFF"/>
+                <w:color w:val="000000"/>
                 <w:sz w:val="20"/>
                 <w:szCs w:val="20"/>
               </w:rPr>
@@ -28117,7 +28117,7 @@
               <w:bottom w:val="single" w:sz="4" w:space="0" w:color="BFBFBF"/>
               <w:right w:val="single" w:sz="4" w:space="0" w:color="BFBFBF"/>
             </w:tcBorders>
-            <w:shd w:val="clear" w:color="auto" w:fill="1F4E79"/>
+            <w:shd w:val="clear" w:color="auto" w:fill="D9D9D9"/>
             <w:tcMar>
               <w:top w:w="60" w:type="dxa"/>
               <w:left w:w="100" w:type="dxa"/>
@@ -28138,7 +28138,7 @@
                 <w:rFonts w:ascii="Times New Roman" w:hAnsi="Times New Roman" w:cs="Times New Roman"/>
                 <w:b/>
                 <w:bCs/>
-                <w:color w:val="FFFFFF"/>
+                <w:color w:val="000000"/>
                 <w:sz w:val="20"/>
                 <w:szCs w:val="20"/>
               </w:rPr>
@@ -28155,7 +28155,7 @@
               <w:bottom w:val="single" w:sz="4" w:space="0" w:color="BFBFBF"/>
               <w:right w:val="single" w:sz="4" w:space="0" w:color="BFBFBF"/>
             </w:tcBorders>
-            <w:shd w:val="clear" w:color="auto" w:fill="1F4E79"/>
+            <w:shd w:val="clear" w:color="auto" w:fill="D9D9D9"/>
             <w:tcMar>
               <w:top w:w="60" w:type="dxa"/>
               <w:left w:w="100" w:type="dxa"/>
@@ -28176,7 +28176,7 @@
                 <w:rFonts w:ascii="Times New Roman" w:hAnsi="Times New Roman" w:cs="Times New Roman"/>
                 <w:b/>
                 <w:bCs/>
-                <w:color w:val="FFFFFF"/>
+                <w:color w:val="000000"/>
                 <w:sz w:val="20"/>
                 <w:szCs w:val="20"/>
               </w:rPr>
@@ -28193,7 +28193,7 @@
               <w:bottom w:val="single" w:sz="4" w:space="0" w:color="BFBFBF"/>
               <w:right w:val="single" w:sz="4" w:space="0" w:color="BFBFBF"/>
             </w:tcBorders>
-            <w:shd w:val="clear" w:color="auto" w:fill="1F4E79"/>
+            <w:shd w:val="clear" w:color="auto" w:fill="D9D9D9"/>
             <w:tcMar>
               <w:top w:w="60" w:type="dxa"/>
               <w:left w:w="100" w:type="dxa"/>
@@ -28214,7 +28214,7 @@
                 <w:rFonts w:ascii="Times New Roman" w:hAnsi="Times New Roman" w:cs="Times New Roman"/>
                 <w:b/>
                 <w:bCs/>
-                <w:color w:val="FFFFFF"/>
+                <w:color w:val="000000"/>
                 <w:sz w:val="20"/>
                 <w:szCs w:val="20"/>
               </w:rPr>
@@ -29095,7 +29095,7 @@
               <w:bottom w:val="single" w:sz="4" w:space="0" w:color="BFBFBF"/>
               <w:right w:val="single" w:sz="4" w:space="0" w:color="BFBFBF"/>
             </w:tcBorders>
-            <w:shd w:val="clear" w:color="auto" w:fill="1F4E79"/>
+            <w:shd w:val="clear" w:color="auto" w:fill="D9D9D9"/>
             <w:tcMar>
               <w:top w:w="60" w:type="dxa"/>
               <w:left w:w="100" w:type="dxa"/>
@@ -29116,7 +29116,7 @@
                 <w:rFonts w:ascii="Times New Roman" w:hAnsi="Times New Roman" w:cs="Times New Roman"/>
                 <w:b/>
                 <w:bCs/>
-                <w:color w:val="FFFFFF"/>
+                <w:color w:val="000000"/>
                 <w:sz w:val="20"/>
                 <w:szCs w:val="20"/>
               </w:rPr>
@@ -29133,7 +29133,7 @@
               <w:bottom w:val="single" w:sz="4" w:space="0" w:color="BFBFBF"/>
               <w:right w:val="single" w:sz="4" w:space="0" w:color="BFBFBF"/>
             </w:tcBorders>
-            <w:shd w:val="clear" w:color="auto" w:fill="1F4E79"/>
+            <w:shd w:val="clear" w:color="auto" w:fill="D9D9D9"/>
             <w:tcMar>
               <w:top w:w="60" w:type="dxa"/>
               <w:left w:w="100" w:type="dxa"/>
@@ -29154,7 +29154,7 @@
                 <w:rFonts w:ascii="Times New Roman" w:hAnsi="Times New Roman" w:cs="Times New Roman"/>
                 <w:b/>
                 <w:bCs/>
-                <w:color w:val="FFFFFF"/>
+                <w:color w:val="000000"/>
                 <w:sz w:val="20"/>
                 <w:szCs w:val="20"/>
               </w:rPr>
@@ -30252,7 +30252,7 @@
               <w:bottom w:val="single" w:sz="4" w:space="0" w:color="BFBFBF"/>
               <w:right w:val="single" w:sz="4" w:space="0" w:color="BFBFBF"/>
             </w:tcBorders>
-            <w:shd w:val="clear" w:color="auto" w:fill="1F4E79"/>
+            <w:shd w:val="clear" w:color="auto" w:fill="D9D9D9"/>
             <w:tcMar>
               <w:top w:w="60" w:type="dxa"/>
               <w:left w:w="100" w:type="dxa"/>
@@ -30273,7 +30273,7 @@
                 <w:rFonts w:ascii="Times New Roman" w:hAnsi="Times New Roman" w:cs="Times New Roman"/>
                 <w:b/>
                 <w:bCs/>
-                <w:color w:val="FFFFFF"/>
+                <w:color w:val="000000"/>
                 <w:sz w:val="24"/>
                 <w:szCs w:val="24"/>
               </w:rPr>
@@ -30290,7 +30290,7 @@
               <w:bottom w:val="single" w:sz="4" w:space="0" w:color="BFBFBF"/>
               <w:right w:val="single" w:sz="4" w:space="0" w:color="BFBFBF"/>
             </w:tcBorders>
-            <w:shd w:val="clear" w:color="auto" w:fill="1F4E79"/>
+            <w:shd w:val="clear" w:color="auto" w:fill="D9D9D9"/>
             <w:tcMar>
               <w:top w:w="60" w:type="dxa"/>
               <w:left w:w="100" w:type="dxa"/>
@@ -30311,7 +30311,7 @@
                 <w:rFonts w:ascii="Times New Roman" w:hAnsi="Times New Roman" w:cs="Times New Roman"/>
                 <w:b/>
                 <w:bCs/>
-                <w:color w:val="FFFFFF"/>
+                <w:color w:val="000000"/>
                 <w:sz w:val="24"/>
                 <w:szCs w:val="24"/>
               </w:rPr>
@@ -30328,7 +30328,7 @@
               <w:bottom w:val="single" w:sz="4" w:space="0" w:color="BFBFBF"/>
               <w:right w:val="single" w:sz="4" w:space="0" w:color="BFBFBF"/>
             </w:tcBorders>
-            <w:shd w:val="clear" w:color="auto" w:fill="1F4E79"/>
+            <w:shd w:val="clear" w:color="auto" w:fill="D9D9D9"/>
             <w:tcMar>
               <w:top w:w="60" w:type="dxa"/>
               <w:left w:w="100" w:type="dxa"/>
@@ -30349,7 +30349,7 @@
                 <w:rFonts w:ascii="Times New Roman" w:hAnsi="Times New Roman" w:cs="Times New Roman"/>
                 <w:b/>
                 <w:bCs/>
-                <w:color w:val="FFFFFF"/>
+                <w:color w:val="000000"/>
                 <w:sz w:val="24"/>
                 <w:szCs w:val="24"/>
               </w:rPr>
@@ -30366,7 +30366,7 @@
               <w:bottom w:val="single" w:sz="4" w:space="0" w:color="BFBFBF"/>
               <w:right w:val="single" w:sz="4" w:space="0" w:color="BFBFBF"/>
             </w:tcBorders>
-            <w:shd w:val="clear" w:color="auto" w:fill="1F4E79"/>
+            <w:shd w:val="clear" w:color="auto" w:fill="D9D9D9"/>
             <w:tcMar>
               <w:top w:w="60" w:type="dxa"/>
               <w:left w:w="100" w:type="dxa"/>
@@ -30387,7 +30387,7 @@
                 <w:rFonts w:ascii="Times New Roman" w:hAnsi="Times New Roman" w:cs="Times New Roman"/>
                 <w:b/>
                 <w:bCs/>
-                <w:color w:val="FFFFFF"/>
+                <w:color w:val="000000"/>
                 <w:sz w:val="24"/>
                 <w:szCs w:val="24"/>
               </w:rPr>
@@ -33896,7 +33896,7 @@
     <w:rPr>
       <w:b/>
       <w:bCs/>
-      <w:color w:val="1F4E79"/>
+      <w:color w:val="000000"/>
       <w:sz w:val="32"/>
       <w:szCs w:val="32"/>
     </w:rPr>
@@ -33913,7 +33913,7 @@
     <w:rPr>
       <w:b/>
       <w:bCs/>
-      <w:color w:val="2E75B6"/>
+      <w:color w:val="000000"/>
       <w:sz w:val="26"/>
       <w:szCs w:val="26"/>
     </w:rPr>
@@ -33928,7 +33928,7 @@
       <w:outlineLvl w:val="2"/>
     </w:pPr>
     <w:rPr>
-      <w:color w:val="1F4D78"/>
+      <w:color w:val="000000"/>
       <w:sz w:val="24"/>
       <w:szCs w:val="24"/>
     </w:rPr>
@@ -33945,7 +33945,7 @@
     <w:rPr>
       <w:i/>
       <w:iCs/>
-      <w:color w:val="2E74B5"/>
+      <w:color w:val="000000"/>
     </w:rPr>
   </w:style>
   <w:style w:type="paragraph" w:styleId="Ttulo5">
@@ -33958,7 +33958,7 @@
       <w:outlineLvl w:val="4"/>
     </w:pPr>
     <w:rPr>
-      <w:color w:val="2E74B5"/>
+      <w:color w:val="000000"/>
     </w:rPr>
   </w:style>
   <w:style w:type="paragraph" w:styleId="Ttulo6">
@@ -33971,7 +33971,7 @@
       <w:outlineLvl w:val="5"/>
     </w:pPr>
     <w:rPr>
-      <w:color w:val="1F4D78"/>
+      <w:color w:val="000000"/>
     </w:rPr>
   </w:style>
   <w:style w:type="character" w:default="1" w:styleId="Fuentedeprrafopredeter">
@@ -34026,7 +34026,7 @@
     <w:uiPriority w:val="99"/>
     <w:unhideWhenUsed/>
     <w:rPr>
-      <w:color w:val="0563C1"/>
+      <w:color w:val="000000"/>
       <w:u w:val="single"/>
     </w:rPr>
   </w:style>
@@ -34135,7 +34135,7 @@
       <w:rFonts w:asciiTheme="majorHAnsi" w:eastAsiaTheme="majorEastAsia" w:hAnsiTheme="majorHAnsi" w:cstheme="majorBidi"/>
       <w:b w:val="0"/>
       <w:bCs w:val="0"/>
-      <w:color w:val="0F4761" w:themeColor="accent1" w:themeShade="BF"/>
+      <w:color w:val="000000"/>
     </w:rPr>
   </w:style>
 </w:styles>

</xml_diff>